<commit_message>
Update README and versioning; enhance copy menu functionality and tests
</commit_message>
<xml_diff>
--- a/_tools/edge-minimal.docx
+++ b/_tools/edge-minimal.docx
@@ -141,6 +141,31 @@
           <w:rFonts w:ascii="Simplified Arabic" w:cs="Simplified Arabic" w:eastAsia="Simplified Arabic" w:hAnsi="Simplified Arabic" w:hint="cs"/>
         </w:rPr>
         <w:t xml:space="preserve">استناداً إلى الخطة السنوية لشعبة تفتيش المؤسسات الصحية الحكومية، أجرى فريق من قسم التفتيش / شعبة تفتيش المؤسسات الصحية الحكومية زيارة تفتيشية إلى مركز صحي م. اختبار بتاريخ 5/1/2026، وتم ملاحظة الآتي:</w:t>
+      </w:r>
+    </w:p>
+    <w:p>
+      <w:pPr>
+        <w:pStyle w:val="Heading2"/>
+        <w:pBdr>
+          <w:bottom w:val="single" w:color="00796B" w:sz="6" w:space="3"/>
+        </w:pBdr>
+        <w:bidi/>
+        <w:spacing w:before="180" w:after="70" w:line="276" w:lineRule="auto"/>
+        <w:jc w:val="right"/>
+      </w:pPr>
+      <w:r>
+        <w:rPr>
+          <w:b/>
+          <w:bCs/>
+          <w:i w:val="false"/>
+          <w:iCs w:val="false"/>
+          <w:color w:val="004D40"/>
+          <w:sz w:val="26"/>
+          <w:szCs w:val="26"/>
+          <w:rtl/>
+          <w:rFonts w:ascii="Simplified Arabic" w:cs="Simplified Arabic" w:eastAsia="Simplified Arabic" w:hAnsi="Simplified Arabic" w:hint="cs"/>
+        </w:rPr>
+        <w:t xml:space="preserve">المحور الاداري/</w:t>
       </w:r>
     </w:p>
     <w:sectPr>

</xml_diff>